<commit_message>
Agregar proyecto CBV al portafolio
</commit_message>
<xml_diff>
--- a/output/manual/FMV_Portfolio_Implementation_Manual_EN_Updated.docx
+++ b/output/manual/FMV_Portfolio_Implementation_Manual_EN_Updated.docx
@@ -176,7 +176,7 @@
                 <w:b w:val="0"/>
                 <w:sz w:val="18"/>
               </w:rPr>
-              <w:t>2026-08-14</w:t>
+              <w:t>2026-08-18</w:t>
             </w:r>
           </w:p>
         </w:tc>
@@ -299,6 +299,14 @@
       </w:pPr>
       <w:r>
         <w:t>Independent areas: cybersecurity, infrastructure, software, technical virtual assistance and automotive mechatronics.</w:t>
+      </w:r>
+    </w:p>
+    <w:p>
+      <w:pPr>
+        <w:pStyle w:val="ListBullet"/>
+      </w:pPr>
+      <w:r>
+        <w:t>Six technical cases presented without exposing clients or private repositories; this includes CBV, a secure API for a virtual education campus.</w:t>
       </w:r>
     </w:p>
     <w:p>

</xml_diff>